<commit_message>
T&C v2026-07-21: remove clause 8.2, cut liability cap to Rs. 5,000
- Delete 8.2 (12-month soft-luggage free repair guarantee) entirely
- Renumber 8.3-8.8 down by one; fix the Part-1 cross-reference that pointed
  at the old 8.5 no-guarantee list (now 8.4)
- 13.1 aggregate liability cap reduced from Rs. 10,000 to Rs. 5,000
- Bump effective date / document version to 2026-07-21

Regenerated both docx and pdf; schema-validated and content-verified.

Co-Authored-By: Claude Sonnet 5 <noreply@anthropic.com>
</commit_message>
<xml_diff>
--- a/Chanakya_Terms_and_Conditions.docx
+++ b/Chanakya_Terms_and_Conditions.docx
@@ -44,7 +44,7 @@
           <w:sz w:val="22"/>
           <w:szCs w:val="22"/>
         </w:rPr>
-        <w:t xml:space="preserve">Effective Date: 2026-07-16</w:t>
+        <w:t xml:space="preserve">Effective Date: 2026-07-21</w:t>
       </w:r>
     </w:p>
     <w:p>
@@ -249,7 +249,7 @@
         <w:spacing w:after="80"/>
       </w:pPr>
       <w:r>
-        <w:t xml:space="preserve">Some product categories (umbrellas, lunch boxes, water bottles, fancy imported bags, gift articles, etc.) carry no free guarantee — see Section 8.5 for the full list.</w:t>
+        <w:t xml:space="preserve">Some product categories (umbrellas, lunch boxes, water bottles, fancy imported bags, gift articles, etc.) carry no free guarantee — see Section 8.4 for the full list.</w:t>
       </w:r>
     </w:p>
     <w:p>
@@ -1135,31 +1135,23 @@
         <w:spacing w:after="120"/>
       </w:pPr>
       <w:r>
-        <w:t xml:space="preserve">8.2 Free repair guarantee — Soft Luggage. We offer a 12-month free repair guarantee against manufacturing / workmanship defects on soft luggage, EXCEPT the chain (zip), the stroller / wheel assembly, and the lock — these are explicitly excluded from the free guarantee. A physical invoice — or, where unavailable, a clear soft copy — is mandatory to initiate any claim under this Section; without it, no claim can be processed.</w:t>
-      </w:r>
-    </w:p>
-    <w:p>
-      <w:pPr>
-        <w:spacing w:after="120"/>
-      </w:pPr>
-      <w:r>
-        <w:t xml:space="preserve">8.3 Free repair guarantee — School Bags, College Bags, Laptop Bags. We offer a 12-month free repair guarantee on school bags, college bags, and laptop bags covering chain (zip) alignment issues and basic stitching involving simple thread-stitch work. Any other issue — including tears, installation of a new chain (zip), or any other internal or external damage — will be serviced but is chargeable. The shop invoice is mandatory to initiate any claim under this Section; where the physical invoice is unavailable, a clear soft copy is acceptable. Without either, no claim can be processed.</w:t>
-      </w:r>
-    </w:p>
-    <w:p>
-      <w:pPr>
-        <w:spacing w:after="120"/>
-      </w:pPr>
-      <w:r>
-        <w:t xml:space="preserve">8.4 Certain material upgrades are exempt from labour charges — you pay only the price of the new materials. Please note, however, that select specialised upgrades may attract both material and labour charges; any such charges will be communicated in the quotation before work begins.</w:t>
-      </w:r>
-    </w:p>
-    <w:p>
-      <w:pPr>
-        <w:spacing w:after="120"/>
-      </w:pPr>
-      <w:r>
-        <w:t xml:space="preserve">8.5 No-guarantee categories. We do NOT offer any free guarantee or replacement on the following product categories, irrespective of when they were purchased:</w:t>
+        <w:t xml:space="preserve">8.2 Free repair guarantee — School Bags, College Bags, Laptop Bags. We offer a 12-month free repair guarantee on school bags, college bags, and laptop bags covering chain (zip) alignment issues and basic stitching involving simple thread-stitch work. Any other issue — including tears, installation of a new chain (zip), or any other internal or external damage — will be serviced but is chargeable. The shop invoice is mandatory to initiate any claim under this Section; where the physical invoice is unavailable, a clear soft copy is acceptable. Without either, no claim can be processed.</w:t>
+      </w:r>
+    </w:p>
+    <w:p>
+      <w:pPr>
+        <w:spacing w:after="120"/>
+      </w:pPr>
+      <w:r>
+        <w:t xml:space="preserve">8.3 Certain material upgrades are exempt from labour charges — you pay only the price of the new materials. Please note, however, that select specialised upgrades may attract both material and labour charges; any such charges will be communicated in the quotation before work begins.</w:t>
+      </w:r>
+    </w:p>
+    <w:p>
+      <w:pPr>
+        <w:spacing w:after="120"/>
+      </w:pPr>
+      <w:r>
+        <w:t xml:space="preserve">8.4 No-guarantee categories. We do NOT offer any free guarantee or replacement on the following product categories, irrespective of when they were purchased:</w:t>
       </w:r>
     </w:p>
     <w:p>
@@ -1297,23 +1289,23 @@
         <w:spacing w:after="120"/>
       </w:pPr>
       <w:r>
-        <w:t xml:space="preserve">8.6 We do not retain or store your sales invoice, warranty card, or guarantee card in any form. It is the sole responsibility of the customer to safeguard these documents and produce them (physically, or as a clear soft copy) at the time of any warranty / guarantee claim. Without them, no claim can be processed.</w:t>
-      </w:r>
-    </w:p>
-    <w:p>
-      <w:pPr>
-        <w:spacing w:after="120"/>
-      </w:pPr>
-      <w:r>
-        <w:t xml:space="preserve">8.7 Workmanship guarantee on paid repairs. Where you pay us for a repair (i.e., outside the free guarantee period above), we provide a 30-day workmanship guarantee against the specific repair performed. If the same component fails under normal use within 30 days, we will re-repair it at no charge. This excludes new damage, misuse, accidents, or damage to other parts of the bag, and does not cover cleaning, polishing, or other aesthetic services.</w:t>
-      </w:r>
-    </w:p>
-    <w:p>
-      <w:pPr>
-        <w:spacing w:after="120"/>
-      </w:pPr>
-      <w:r>
-        <w:t xml:space="preserve">8.8 Guarantee-period repairs are processed on weekdays only — Monday to Friday during store hours. Guarantee-period repair drop-offs and pickups are NOT entertained on Saturdays and Sundays. Out-of-guarantee paid repairs continue to be accepted on all 7 days during store hours.</w:t>
+        <w:t xml:space="preserve">8.5 We do not retain or store your sales invoice, warranty card, or guarantee card in any form. It is the sole responsibility of the customer to safeguard these documents and produce them (physically, or as a clear soft copy) at the time of any warranty / guarantee claim. Without them, no claim can be processed.</w:t>
+      </w:r>
+    </w:p>
+    <w:p>
+      <w:pPr>
+        <w:spacing w:after="120"/>
+      </w:pPr>
+      <w:r>
+        <w:t xml:space="preserve">8.6 Workmanship guarantee on paid repairs. Where you pay us for a repair (i.e., outside the free guarantee period above), we provide a 30-day workmanship guarantee against the specific repair performed. If the same component fails under normal use within 30 days, we will re-repair it at no charge. This excludes new damage, misuse, accidents, or damage to other parts of the bag, and does not cover cleaning, polishing, or other aesthetic services.</w:t>
+      </w:r>
+    </w:p>
+    <w:p>
+      <w:pPr>
+        <w:spacing w:after="120"/>
+      </w:pPr>
+      <w:r>
+        <w:t xml:space="preserve">8.7 Guarantee-period repairs are processed on weekdays only — Monday to Friday during store hours. Guarantee-period repair drop-offs and pickups are NOT entertained on Saturdays and Sundays. Out-of-guarantee paid repairs continue to be accepted on all 7 days during store hours.</w:t>
       </w:r>
     </w:p>
     <w:p>
@@ -1614,7 +1606,7 @@
         <w:spacing w:after="120"/>
       </w:pPr>
       <w:r>
-        <w:t xml:space="preserve">13.1 To the maximum extent permitted by Indian law, our aggregate liability for any claim arising out of or in connection with the Services (whether in contract, tort, or otherwise) shall not exceed the amount actually paid by you to Chanakya in the preceding 12 months, or ₹10,000 (Rupees Ten Thousand), whichever is higher.</w:t>
+        <w:t xml:space="preserve">13.1 To the maximum extent permitted by Indian law, our aggregate liability for any claim arising out of or in connection with the Services (whether in contract, tort, or otherwise) shall not exceed the amount actually paid by you to Chanakya in the preceding 12 months, or ₹5,000 (Rupees Five Thousand), whichever is higher.</w:t>
       </w:r>
     </w:p>
     <w:p>
@@ -1929,7 +1921,7 @@
         <w:spacing w:after="120"/>
       </w:pPr>
       <w:r>
-        <w:t xml:space="preserve">Document version: 2026-07-16</w:t>
+        <w:t xml:space="preserve">Document version: 2026-07-21</w:t>
       </w:r>
     </w:p>
     <w:sectPr>

</xml_diff>